<commit_message>
Lab 2 DB finish
</commit_message>
<xml_diff>
--- a/Бази даних/Драч_ЛР№2_Звіт.docx
+++ b/Бази даних/Драч_ЛР№2_Звіт.docx
@@ -257,57 +257,25 @@
           <w:szCs w:val="28"/>
           <w:lang w:val="uk-UA"/>
         </w:rPr>
-        <w:t>1 Ознайоми</w:t>
-      </w:r>
-      <w:r>
-        <w:rPr>
-          <w:sz w:val="28"/>
-          <w:szCs w:val="28"/>
-          <w:lang w:val="uk-UA"/>
-        </w:rPr>
-        <w:t>вся</w:t>
-      </w:r>
-      <w:r>
-        <w:rPr>
-          <w:sz w:val="28"/>
-          <w:szCs w:val="28"/>
-          <w:lang w:val="uk-UA"/>
-        </w:rPr>
-        <w:t xml:space="preserve"> з інструкцією по виконанню лабораторної роботи</w:t>
-      </w:r>
-    </w:p>
-    <w:p>
-      <w:pPr>
-        <w:spacing w:after="0"/>
-        <w:rPr>
-          <w:sz w:val="28"/>
-          <w:szCs w:val="28"/>
-          <w:lang w:val="uk-UA"/>
-        </w:rPr>
-      </w:pPr>
-      <w:r>
-        <w:rPr>
-          <w:sz w:val="28"/>
-          <w:szCs w:val="28"/>
-          <w:lang w:val="uk-UA"/>
-        </w:rPr>
-        <w:t>2 Запусти</w:t>
-      </w:r>
-      <w:r>
-        <w:rPr>
-          <w:sz w:val="28"/>
-          <w:szCs w:val="28"/>
-          <w:lang w:val="uk-UA"/>
-        </w:rPr>
-        <w:t>в</w:t>
-      </w:r>
-      <w:r>
-        <w:rPr>
-          <w:sz w:val="28"/>
-          <w:szCs w:val="28"/>
-          <w:lang w:val="uk-UA"/>
-        </w:rPr>
-        <w:t xml:space="preserve"> середовище </w:t>
+        <w:t>1 Ознайомився з інструкцією по виконанню лабораторної роботи</w:t>
+      </w:r>
+    </w:p>
+    <w:p>
+      <w:pPr>
+        <w:spacing w:after="0"/>
+        <w:rPr>
+          <w:sz w:val="28"/>
+          <w:szCs w:val="28"/>
+          <w:lang w:val="uk-UA"/>
+        </w:rPr>
+      </w:pPr>
+      <w:r>
+        <w:rPr>
+          <w:sz w:val="28"/>
+          <w:szCs w:val="28"/>
+          <w:lang w:val="uk-UA"/>
+        </w:rPr>
+        <w:t xml:space="preserve">2 Запустив середовище </w:t>
       </w:r>
       <w:proofErr w:type="spellStart"/>
       <w:r>
@@ -343,23 +311,7 @@
           <w:szCs w:val="28"/>
           <w:lang w:val="uk-UA"/>
         </w:rPr>
-        <w:t>. Створи</w:t>
-      </w:r>
-      <w:r>
-        <w:rPr>
-          <w:sz w:val="28"/>
-          <w:szCs w:val="28"/>
-          <w:lang w:val="uk-UA"/>
-        </w:rPr>
-        <w:t>в</w:t>
-      </w:r>
-      <w:r>
-        <w:rPr>
-          <w:sz w:val="28"/>
-          <w:szCs w:val="28"/>
-          <w:lang w:val="uk-UA"/>
-        </w:rPr>
-        <w:t xml:space="preserve"> нову модель та </w:t>
+        <w:t xml:space="preserve">. Створив нову модель та </w:t>
       </w:r>
       <w:proofErr w:type="spellStart"/>
       <w:r>
@@ -368,15 +320,7 @@
           <w:szCs w:val="28"/>
           <w:lang w:val="uk-UA"/>
         </w:rPr>
-        <w:t>збере</w:t>
-      </w:r>
-      <w:r>
-        <w:rPr>
-          <w:sz w:val="28"/>
-          <w:szCs w:val="28"/>
-          <w:lang w:val="uk-UA"/>
-        </w:rPr>
-        <w:t>іг</w:t>
+        <w:t>збереіг</w:t>
       </w:r>
       <w:proofErr w:type="spellEnd"/>
       <w:r>
@@ -385,115 +329,43 @@
           <w:szCs w:val="28"/>
           <w:lang w:val="uk-UA"/>
         </w:rPr>
-        <w:t xml:space="preserve"> </w:t>
-      </w:r>
-      <w:r>
-        <w:rPr>
-          <w:sz w:val="28"/>
-          <w:szCs w:val="28"/>
-          <w:lang w:val="uk-UA"/>
-        </w:rPr>
-        <w:t>її у власну папку під ім’ям Модель2_1_</w:t>
-      </w:r>
-      <w:r>
-        <w:rPr>
-          <w:sz w:val="28"/>
-          <w:szCs w:val="28"/>
-          <w:lang w:val="uk-UA"/>
-        </w:rPr>
-        <w:t>Драч</w:t>
-      </w:r>
-      <w:r>
-        <w:rPr>
-          <w:sz w:val="28"/>
-          <w:szCs w:val="28"/>
-          <w:lang w:val="uk-UA"/>
-        </w:rPr>
-        <w:t>.</w:t>
-      </w:r>
-    </w:p>
-    <w:p>
-      <w:pPr>
-        <w:spacing w:after="0"/>
-        <w:rPr>
-          <w:sz w:val="28"/>
-          <w:szCs w:val="28"/>
-          <w:lang w:val="uk-UA"/>
-        </w:rPr>
-      </w:pPr>
-      <w:r>
-        <w:rPr>
-          <w:sz w:val="28"/>
-          <w:szCs w:val="28"/>
-          <w:lang w:val="uk-UA"/>
-        </w:rPr>
-        <w:t>3. Викона</w:t>
-      </w:r>
-      <w:r>
-        <w:rPr>
-          <w:sz w:val="28"/>
-          <w:szCs w:val="28"/>
-          <w:lang w:val="uk-UA"/>
-        </w:rPr>
-        <w:t>в</w:t>
-      </w:r>
-      <w:r>
-        <w:rPr>
-          <w:sz w:val="28"/>
-          <w:szCs w:val="28"/>
-          <w:lang w:val="uk-UA"/>
-        </w:rPr>
-        <w:t xml:space="preserve"> нормалізацію таблиці до першої, другої та третьої нормальних</w:t>
-      </w:r>
-      <w:r>
-        <w:rPr>
-          <w:sz w:val="28"/>
-          <w:szCs w:val="28"/>
-          <w:lang w:val="uk-UA"/>
-        </w:rPr>
-        <w:t xml:space="preserve"> </w:t>
-      </w:r>
-      <w:r>
-        <w:rPr>
-          <w:sz w:val="28"/>
-          <w:szCs w:val="28"/>
-          <w:lang w:val="uk-UA"/>
-        </w:rPr>
-        <w:t>форм за індивідуальним варіантом.</w:t>
-      </w:r>
-    </w:p>
-    <w:p>
-      <w:pPr>
-        <w:spacing w:after="0"/>
-        <w:rPr>
-          <w:sz w:val="28"/>
-          <w:szCs w:val="28"/>
-          <w:lang w:val="uk-UA"/>
-        </w:rPr>
-      </w:pPr>
-      <w:r>
-        <w:rPr>
-          <w:sz w:val="28"/>
-          <w:szCs w:val="28"/>
-          <w:lang w:val="uk-UA"/>
-        </w:rPr>
-        <w:t>4. Заповни</w:t>
-      </w:r>
-      <w:r>
-        <w:rPr>
-          <w:sz w:val="28"/>
-          <w:szCs w:val="28"/>
-          <w:lang w:val="uk-UA"/>
-        </w:rPr>
-        <w:t>в</w:t>
-      </w:r>
-      <w:r>
-        <w:rPr>
-          <w:sz w:val="28"/>
-          <w:szCs w:val="28"/>
-          <w:lang w:val="uk-UA"/>
-        </w:rPr>
-        <w:t xml:space="preserve"> Таблицю перетворень</w:t>
+        <w:t xml:space="preserve"> її у власну папку під ім’ям Модель2_1_Драч.</w:t>
+      </w:r>
+    </w:p>
+    <w:p>
+      <w:pPr>
+        <w:spacing w:after="0"/>
+        <w:rPr>
+          <w:sz w:val="28"/>
+          <w:szCs w:val="28"/>
+          <w:lang w:val="uk-UA"/>
+        </w:rPr>
+      </w:pPr>
+      <w:r>
+        <w:rPr>
+          <w:sz w:val="28"/>
+          <w:szCs w:val="28"/>
+          <w:lang w:val="uk-UA"/>
+        </w:rPr>
+        <w:t>3. Виконав нормалізацію таблиці до першої, другої та третьої нормальних форм за індивідуальним варіантом.</w:t>
+      </w:r>
+    </w:p>
+    <w:p>
+      <w:pPr>
+        <w:spacing w:after="0"/>
+        <w:rPr>
+          <w:sz w:val="28"/>
+          <w:szCs w:val="28"/>
+          <w:lang w:val="uk-UA"/>
+        </w:rPr>
+      </w:pPr>
+      <w:r>
+        <w:rPr>
+          <w:sz w:val="28"/>
+          <w:szCs w:val="28"/>
+          <w:lang w:val="uk-UA"/>
+        </w:rPr>
+        <w:t>4. Заповнив Таблицю перетворень</w:t>
       </w:r>
     </w:p>
     <w:p>
@@ -827,14 +699,14 @@
         <w:tblLook w:val="04A0" w:firstRow="1" w:lastRow="0" w:firstColumn="1" w:lastColumn="0" w:noHBand="0" w:noVBand="1"/>
       </w:tblPr>
       <w:tblGrid>
-        <w:gridCol w:w="3485"/>
-        <w:gridCol w:w="3485"/>
+        <w:gridCol w:w="1271"/>
+        <w:gridCol w:w="5699"/>
         <w:gridCol w:w="3486"/>
       </w:tblGrid>
       <w:tr>
         <w:tc>
           <w:tcPr>
-            <w:tcW w:w="3485" w:type="dxa"/>
+            <w:tcW w:w="1271" w:type="dxa"/>
           </w:tcPr>
           <w:p>
             <w:pPr>
@@ -856,7 +728,7 @@
         </w:tc>
         <w:tc>
           <w:tcPr>
-            <w:tcW w:w="3485" w:type="dxa"/>
+            <w:tcW w:w="5699" w:type="dxa"/>
           </w:tcPr>
           <w:p>
             <w:pPr>
@@ -902,7 +774,7 @@
       <w:tr>
         <w:tc>
           <w:tcPr>
-            <w:tcW w:w="3485" w:type="dxa"/>
+            <w:tcW w:w="1271" w:type="dxa"/>
           </w:tcPr>
           <w:p>
             <w:pPr>
@@ -912,19 +784,21 @@
                 <w:lang w:val="uk-UA"/>
               </w:rPr>
             </w:pPr>
-            <w:r>
-              <w:rPr>
-                <w:sz w:val="28"/>
-                <w:szCs w:val="28"/>
-                <w:lang w:val="uk-UA"/>
-              </w:rPr>
-              <w:t>Не нормальна форма</w:t>
-            </w:r>
+            <w:proofErr w:type="spellStart"/>
+            <w:r>
+              <w:rPr>
+                <w:sz w:val="28"/>
+                <w:szCs w:val="28"/>
+                <w:lang w:val="uk-UA"/>
+              </w:rPr>
+              <w:t>ННф</w:t>
+            </w:r>
+            <w:proofErr w:type="spellEnd"/>
           </w:p>
         </w:tc>
         <w:tc>
           <w:tcPr>
-            <w:tcW w:w="3485" w:type="dxa"/>
+            <w:tcW w:w="5699" w:type="dxa"/>
           </w:tcPr>
           <w:p>
             <w:pPr>
@@ -972,7 +846,7 @@
       <w:tr>
         <w:tc>
           <w:tcPr>
-            <w:tcW w:w="3485" w:type="dxa"/>
+            <w:tcW w:w="1271" w:type="dxa"/>
           </w:tcPr>
           <w:p>
             <w:pPr>
@@ -987,13 +861,21 @@
                 <w:szCs w:val="28"/>
                 <w:lang w:val="uk-UA"/>
               </w:rPr>
-              <w:t>1 Нормальна форма</w:t>
+              <w:t>1</w:t>
+            </w:r>
+            <w:r>
+              <w:rPr>
+                <w:sz w:val="28"/>
+                <w:szCs w:val="28"/>
+                <w:lang w:val="uk-UA"/>
+              </w:rPr>
+              <w:t>НФ</w:t>
             </w:r>
           </w:p>
         </w:tc>
         <w:tc>
           <w:tcPr>
-            <w:tcW w:w="3485" w:type="dxa"/>
+            <w:tcW w:w="5699" w:type="dxa"/>
           </w:tcPr>
           <w:p>
             <w:pPr>
@@ -1002,6 +884,59 @@
                 <w:szCs w:val="28"/>
               </w:rPr>
             </w:pPr>
+            <w:proofErr w:type="spellStart"/>
+            <w:r>
+              <w:rPr>
+                <w:sz w:val="28"/>
+                <w:szCs w:val="28"/>
+              </w:rPr>
+              <w:t>Складений</w:t>
+            </w:r>
+            <w:proofErr w:type="spellEnd"/>
+            <w:r>
+              <w:rPr>
+                <w:sz w:val="28"/>
+                <w:szCs w:val="28"/>
+                <w:lang w:val="uk-UA"/>
+              </w:rPr>
+              <w:t xml:space="preserve"> ключ з полів </w:t>
+            </w:r>
+            <w:proofErr w:type="spellStart"/>
+            <w:r>
+              <w:rPr>
+                <w:sz w:val="28"/>
+                <w:szCs w:val="28"/>
+                <w:lang w:val="uk-UA"/>
+              </w:rPr>
+              <w:t>Ім’яУчасника</w:t>
+            </w:r>
+            <w:proofErr w:type="spellEnd"/>
+            <w:r>
+              <w:rPr>
+                <w:sz w:val="28"/>
+                <w:szCs w:val="28"/>
+                <w:lang w:val="uk-UA"/>
+              </w:rPr>
+              <w:t xml:space="preserve">, </w:t>
+            </w:r>
+            <w:proofErr w:type="spellStart"/>
+            <w:r>
+              <w:rPr>
+                <w:sz w:val="28"/>
+                <w:szCs w:val="28"/>
+                <w:lang w:val="uk-UA"/>
+              </w:rPr>
+              <w:t>ФаміліяУчасника</w:t>
+            </w:r>
+            <w:proofErr w:type="spellEnd"/>
+            <w:r>
+              <w:rPr>
+                <w:sz w:val="28"/>
+                <w:szCs w:val="28"/>
+                <w:lang w:val="uk-UA"/>
+              </w:rPr>
+              <w:t xml:space="preserve"> та Вправа</w:t>
+            </w:r>
           </w:p>
         </w:tc>
         <w:tc>
@@ -1015,34 +950,91 @@
                 <w:szCs w:val="28"/>
               </w:rPr>
             </w:pPr>
+            <w:proofErr w:type="spellStart"/>
+            <w:r>
+              <w:rPr>
+                <w:sz w:val="28"/>
+                <w:szCs w:val="28"/>
+                <w:lang w:val="uk-UA"/>
+              </w:rPr>
+              <w:t>Досьє_Учасника</w:t>
+            </w:r>
+            <w:proofErr w:type="spellEnd"/>
+            <w:r>
+              <w:rPr>
+                <w:sz w:val="28"/>
+                <w:szCs w:val="28"/>
+                <w:lang w:val="uk-UA"/>
+              </w:rPr>
+              <w:t xml:space="preserve"> </w:t>
+            </w:r>
           </w:p>
         </w:tc>
       </w:tr>
       <w:tr>
         <w:tc>
           <w:tcPr>
-            <w:tcW w:w="3485" w:type="dxa"/>
+            <w:tcW w:w="1271" w:type="dxa"/>
+            <w:vMerge w:val="restart"/>
           </w:tcPr>
           <w:p>
             <w:pPr>
               <w:rPr>
                 <w:sz w:val="28"/>
                 <w:szCs w:val="28"/>
+                <w:lang w:val="uk-UA"/>
               </w:rPr>
             </w:pPr>
+            <w:r>
+              <w:rPr>
+                <w:sz w:val="28"/>
+                <w:szCs w:val="28"/>
+                <w:lang w:val="uk-UA"/>
+              </w:rPr>
+              <w:t>2НФ</w:t>
+            </w:r>
           </w:p>
         </w:tc>
         <w:tc>
           <w:tcPr>
-            <w:tcW w:w="3485" w:type="dxa"/>
+            <w:tcW w:w="5699" w:type="dxa"/>
           </w:tcPr>
           <w:p>
             <w:pPr>
               <w:rPr>
                 <w:sz w:val="28"/>
                 <w:szCs w:val="28"/>
+                <w:lang w:val="uk-UA"/>
               </w:rPr>
             </w:pPr>
+            <w:proofErr w:type="spellStart"/>
+            <w:r>
+              <w:rPr>
+                <w:sz w:val="28"/>
+                <w:szCs w:val="28"/>
+                <w:lang w:val="uk-UA"/>
+              </w:rPr>
+              <w:t>Ім’яУчасника</w:t>
+            </w:r>
+            <w:proofErr w:type="spellEnd"/>
+            <w:r>
+              <w:rPr>
+                <w:sz w:val="28"/>
+                <w:szCs w:val="28"/>
+                <w:lang w:val="uk-UA"/>
+              </w:rPr>
+              <w:t xml:space="preserve"> + </w:t>
+            </w:r>
+            <w:proofErr w:type="spellStart"/>
+            <w:r>
+              <w:rPr>
+                <w:sz w:val="28"/>
+                <w:szCs w:val="28"/>
+                <w:lang w:val="uk-UA"/>
+              </w:rPr>
+              <w:t>ПрізвищеУчасника</w:t>
+            </w:r>
+            <w:proofErr w:type="spellEnd"/>
           </w:p>
         </w:tc>
         <w:tc>
@@ -1054,36 +1046,160 @@
               <w:rPr>
                 <w:sz w:val="28"/>
                 <w:szCs w:val="28"/>
+                <w:lang w:val="uk-UA"/>
               </w:rPr>
             </w:pPr>
+            <w:r>
+              <w:rPr>
+                <w:sz w:val="28"/>
+                <w:szCs w:val="28"/>
+                <w:lang w:val="uk-UA"/>
+              </w:rPr>
+              <w:t>Учасник</w:t>
+            </w:r>
           </w:p>
         </w:tc>
       </w:tr>
       <w:tr>
         <w:tc>
           <w:tcPr>
-            <w:tcW w:w="3485" w:type="dxa"/>
+            <w:tcW w:w="1271" w:type="dxa"/>
+            <w:vMerge/>
           </w:tcPr>
           <w:p>
             <w:pPr>
               <w:rPr>
                 <w:sz w:val="28"/>
                 <w:szCs w:val="28"/>
+                <w:lang w:val="uk-UA"/>
               </w:rPr>
             </w:pPr>
           </w:p>
         </w:tc>
         <w:tc>
           <w:tcPr>
-            <w:tcW w:w="3485" w:type="dxa"/>
+            <w:tcW w:w="5699" w:type="dxa"/>
           </w:tcPr>
           <w:p>
             <w:pPr>
               <w:rPr>
                 <w:sz w:val="28"/>
                 <w:szCs w:val="28"/>
+                <w:lang w:val="uk-UA"/>
               </w:rPr>
             </w:pPr>
+            <w:r>
+              <w:rPr>
+                <w:sz w:val="28"/>
+                <w:szCs w:val="28"/>
+                <w:lang w:val="uk-UA"/>
+              </w:rPr>
+              <w:t xml:space="preserve">Вправа + </w:t>
+            </w:r>
+            <w:proofErr w:type="spellStart"/>
+            <w:r>
+              <w:rPr>
+                <w:sz w:val="28"/>
+                <w:szCs w:val="28"/>
+              </w:rPr>
+              <w:t>Учасник</w:t>
+            </w:r>
+            <w:proofErr w:type="spellEnd"/>
+            <w:r>
+              <w:rPr>
+                <w:sz w:val="28"/>
+                <w:szCs w:val="28"/>
+              </w:rPr>
+              <w:t>_</w:t>
+            </w:r>
+            <w:proofErr w:type="spellStart"/>
+            <w:r>
+              <w:rPr>
+                <w:sz w:val="28"/>
+                <w:szCs w:val="28"/>
+                <w:lang w:val="uk-UA"/>
+              </w:rPr>
+              <w:t>Ім’яУчасника</w:t>
+            </w:r>
+            <w:proofErr w:type="spellEnd"/>
+            <w:r>
+              <w:rPr>
+                <w:sz w:val="28"/>
+                <w:szCs w:val="28"/>
+                <w:lang w:val="uk-UA"/>
+              </w:rPr>
+              <w:t xml:space="preserve"> </w:t>
+            </w:r>
+            <w:r>
+              <w:rPr>
+                <w:sz w:val="28"/>
+                <w:szCs w:val="28"/>
+              </w:rPr>
+              <w:t>(</w:t>
+            </w:r>
+            <w:r>
+              <w:rPr>
+                <w:sz w:val="28"/>
+                <w:szCs w:val="28"/>
+                <w:lang w:val="en-US"/>
+              </w:rPr>
+              <w:t>FK</w:t>
+            </w:r>
+            <w:r>
+              <w:rPr>
+                <w:sz w:val="28"/>
+                <w:szCs w:val="28"/>
+              </w:rPr>
+              <w:t>)</w:t>
+            </w:r>
+            <w:r>
+              <w:rPr>
+                <w:sz w:val="28"/>
+                <w:szCs w:val="28"/>
+                <w:lang w:val="uk-UA"/>
+              </w:rPr>
+              <w:t xml:space="preserve">+ </w:t>
+            </w:r>
+            <w:proofErr w:type="spellStart"/>
+            <w:r>
+              <w:rPr>
+                <w:sz w:val="28"/>
+                <w:szCs w:val="28"/>
+                <w:lang w:val="uk-UA"/>
+              </w:rPr>
+              <w:t>Учасник_</w:t>
+            </w:r>
+            <w:r>
+              <w:rPr>
+                <w:sz w:val="28"/>
+                <w:szCs w:val="28"/>
+                <w:lang w:val="uk-UA"/>
+              </w:rPr>
+              <w:t>ПрізвищеУчасника</w:t>
+            </w:r>
+            <w:proofErr w:type="spellEnd"/>
+            <w:r>
+              <w:rPr>
+                <w:sz w:val="28"/>
+                <w:szCs w:val="28"/>
+              </w:rPr>
+              <w:t xml:space="preserve"> (</w:t>
+            </w:r>
+            <w:r>
+              <w:rPr>
+                <w:sz w:val="28"/>
+                <w:szCs w:val="28"/>
+                <w:lang w:val="en-US"/>
+              </w:rPr>
+              <w:t>FK</w:t>
+            </w:r>
+            <w:r>
+              <w:rPr>
+                <w:sz w:val="28"/>
+                <w:szCs w:val="28"/>
+              </w:rPr>
+              <w:t>)</w:t>
+            </w:r>
           </w:p>
         </w:tc>
         <w:tc>
@@ -1095,8 +1211,548 @@
               <w:rPr>
                 <w:sz w:val="28"/>
                 <w:szCs w:val="28"/>
+                <w:lang w:val="uk-UA"/>
               </w:rPr>
             </w:pPr>
+            <w:proofErr w:type="spellStart"/>
+            <w:r>
+              <w:rPr>
+                <w:sz w:val="28"/>
+                <w:szCs w:val="28"/>
+                <w:lang w:val="uk-UA"/>
+              </w:rPr>
+              <w:t>Результати_Учасника</w:t>
+            </w:r>
+            <w:proofErr w:type="spellEnd"/>
+          </w:p>
+        </w:tc>
+      </w:tr>
+      <w:tr>
+        <w:tc>
+          <w:tcPr>
+            <w:tcW w:w="1271" w:type="dxa"/>
+            <w:vMerge/>
+          </w:tcPr>
+          <w:p>
+            <w:pPr>
+              <w:rPr>
+                <w:sz w:val="28"/>
+                <w:szCs w:val="28"/>
+                <w:lang w:val="uk-UA"/>
+              </w:rPr>
+            </w:pPr>
+          </w:p>
+        </w:tc>
+        <w:tc>
+          <w:tcPr>
+            <w:tcW w:w="5699" w:type="dxa"/>
+          </w:tcPr>
+          <w:p>
+            <w:pPr>
+              <w:rPr>
+                <w:sz w:val="28"/>
+                <w:szCs w:val="28"/>
+              </w:rPr>
+            </w:pPr>
+            <w:proofErr w:type="spellStart"/>
+            <w:r>
+              <w:rPr>
+                <w:sz w:val="28"/>
+                <w:szCs w:val="28"/>
+                <w:lang w:val="uk-UA"/>
+              </w:rPr>
+              <w:t>СпортСуспільство</w:t>
+            </w:r>
+            <w:proofErr w:type="spellEnd"/>
+          </w:p>
+        </w:tc>
+        <w:tc>
+          <w:tcPr>
+            <w:tcW w:w="3486" w:type="dxa"/>
+          </w:tcPr>
+          <w:p>
+            <w:pPr>
+              <w:rPr>
+                <w:sz w:val="28"/>
+                <w:szCs w:val="28"/>
+                <w:lang w:val="uk-UA"/>
+              </w:rPr>
+            </w:pPr>
+            <w:r>
+              <w:rPr>
+                <w:sz w:val="28"/>
+                <w:szCs w:val="28"/>
+                <w:lang w:val="uk-UA"/>
+              </w:rPr>
+              <w:t>Команда</w:t>
+            </w:r>
+          </w:p>
+        </w:tc>
+      </w:tr>
+      <w:tr>
+        <w:tc>
+          <w:tcPr>
+            <w:tcW w:w="1271" w:type="dxa"/>
+            <w:vMerge w:val="restart"/>
+          </w:tcPr>
+          <w:p>
+            <w:pPr>
+              <w:rPr>
+                <w:sz w:val="28"/>
+                <w:szCs w:val="28"/>
+                <w:lang w:val="en-US"/>
+              </w:rPr>
+            </w:pPr>
+            <w:r>
+              <w:rPr>
+                <w:sz w:val="28"/>
+                <w:szCs w:val="28"/>
+                <w:lang w:val="uk-UA"/>
+              </w:rPr>
+              <w:t>3НФ</w:t>
+            </w:r>
+          </w:p>
+        </w:tc>
+        <w:tc>
+          <w:tcPr>
+            <w:tcW w:w="5699" w:type="dxa"/>
+          </w:tcPr>
+          <w:p>
+            <w:pPr>
+              <w:rPr>
+                <w:sz w:val="28"/>
+                <w:szCs w:val="28"/>
+                <w:lang w:val="uk-UA"/>
+              </w:rPr>
+            </w:pPr>
+            <w:proofErr w:type="spellStart"/>
+            <w:r>
+              <w:rPr>
+                <w:sz w:val="28"/>
+                <w:szCs w:val="28"/>
+                <w:lang w:val="uk-UA"/>
+              </w:rPr>
+              <w:t>Ім’яУчасника</w:t>
+            </w:r>
+            <w:proofErr w:type="spellEnd"/>
+            <w:r>
+              <w:rPr>
+                <w:sz w:val="28"/>
+                <w:szCs w:val="28"/>
+                <w:lang w:val="uk-UA"/>
+              </w:rPr>
+              <w:t xml:space="preserve"> + </w:t>
+            </w:r>
+            <w:proofErr w:type="spellStart"/>
+            <w:r>
+              <w:rPr>
+                <w:sz w:val="28"/>
+                <w:szCs w:val="28"/>
+                <w:lang w:val="uk-UA"/>
+              </w:rPr>
+              <w:t>ПрізвишеУчасника</w:t>
+            </w:r>
+            <w:proofErr w:type="spellEnd"/>
+          </w:p>
+        </w:tc>
+        <w:tc>
+          <w:tcPr>
+            <w:tcW w:w="3486" w:type="dxa"/>
+          </w:tcPr>
+          <w:p>
+            <w:pPr>
+              <w:rPr>
+                <w:sz w:val="28"/>
+                <w:szCs w:val="28"/>
+                <w:lang w:val="uk-UA"/>
+              </w:rPr>
+            </w:pPr>
+            <w:r>
+              <w:rPr>
+                <w:sz w:val="28"/>
+                <w:szCs w:val="28"/>
+                <w:lang w:val="uk-UA"/>
+              </w:rPr>
+              <w:t>Учасник_3НФ</w:t>
+            </w:r>
+          </w:p>
+        </w:tc>
+      </w:tr>
+      <w:tr>
+        <w:tc>
+          <w:tcPr>
+            <w:tcW w:w="1271" w:type="dxa"/>
+            <w:vMerge/>
+          </w:tcPr>
+          <w:p>
+            <w:pPr>
+              <w:rPr>
+                <w:sz w:val="28"/>
+                <w:szCs w:val="28"/>
+                <w:lang w:val="uk-UA"/>
+              </w:rPr>
+            </w:pPr>
+          </w:p>
+        </w:tc>
+        <w:tc>
+          <w:tcPr>
+            <w:tcW w:w="5699" w:type="dxa"/>
+          </w:tcPr>
+          <w:p>
+            <w:pPr>
+              <w:rPr>
+                <w:sz w:val="28"/>
+                <w:szCs w:val="28"/>
+                <w:lang w:val="uk-UA"/>
+              </w:rPr>
+            </w:pPr>
+            <w:r>
+              <w:rPr>
+                <w:sz w:val="28"/>
+                <w:szCs w:val="28"/>
+                <w:lang w:val="uk-UA"/>
+              </w:rPr>
+              <w:t xml:space="preserve">Вправа + </w:t>
+            </w:r>
+            <w:proofErr w:type="spellStart"/>
+            <w:r>
+              <w:rPr>
+                <w:sz w:val="28"/>
+                <w:szCs w:val="28"/>
+              </w:rPr>
+              <w:t>Учасник</w:t>
+            </w:r>
+            <w:proofErr w:type="spellEnd"/>
+            <w:r>
+              <w:rPr>
+                <w:sz w:val="28"/>
+                <w:szCs w:val="28"/>
+                <w:lang w:val="uk-UA"/>
+              </w:rPr>
+              <w:t>_3НФ</w:t>
+            </w:r>
+            <w:r>
+              <w:rPr>
+                <w:sz w:val="28"/>
+                <w:szCs w:val="28"/>
+              </w:rPr>
+              <w:t>_</w:t>
+            </w:r>
+            <w:proofErr w:type="spellStart"/>
+            <w:r>
+              <w:rPr>
+                <w:sz w:val="28"/>
+                <w:szCs w:val="28"/>
+                <w:lang w:val="uk-UA"/>
+              </w:rPr>
+              <w:t>Ім’яУчасника</w:t>
+            </w:r>
+            <w:proofErr w:type="spellEnd"/>
+            <w:r>
+              <w:rPr>
+                <w:sz w:val="28"/>
+                <w:szCs w:val="28"/>
+                <w:lang w:val="uk-UA"/>
+              </w:rPr>
+              <w:t xml:space="preserve"> </w:t>
+            </w:r>
+            <w:r>
+              <w:rPr>
+                <w:sz w:val="28"/>
+                <w:szCs w:val="28"/>
+              </w:rPr>
+              <w:t>(</w:t>
+            </w:r>
+            <w:r>
+              <w:rPr>
+                <w:sz w:val="28"/>
+                <w:szCs w:val="28"/>
+                <w:lang w:val="en-US"/>
+              </w:rPr>
+              <w:t>FK</w:t>
+            </w:r>
+            <w:r>
+              <w:rPr>
+                <w:sz w:val="28"/>
+                <w:szCs w:val="28"/>
+              </w:rPr>
+              <w:t>)</w:t>
+            </w:r>
+            <w:r>
+              <w:rPr>
+                <w:sz w:val="28"/>
+                <w:szCs w:val="28"/>
+                <w:lang w:val="uk-UA"/>
+              </w:rPr>
+              <w:t>+ Учасник_</w:t>
+            </w:r>
+            <w:r>
+              <w:rPr>
+                <w:sz w:val="28"/>
+                <w:szCs w:val="28"/>
+                <w:lang w:val="uk-UA"/>
+              </w:rPr>
+              <w:t>3НФ_</w:t>
+            </w:r>
+            <w:r>
+              <w:rPr>
+                <w:sz w:val="28"/>
+                <w:szCs w:val="28"/>
+                <w:lang w:val="uk-UA"/>
+              </w:rPr>
+              <w:t>ПрізвищеУчасника</w:t>
+            </w:r>
+            <w:r>
+              <w:rPr>
+                <w:sz w:val="28"/>
+                <w:szCs w:val="28"/>
+              </w:rPr>
+              <w:t xml:space="preserve"> (</w:t>
+            </w:r>
+            <w:r>
+              <w:rPr>
+                <w:sz w:val="28"/>
+                <w:szCs w:val="28"/>
+                <w:lang w:val="en-US"/>
+              </w:rPr>
+              <w:t>FK</w:t>
+            </w:r>
+            <w:r>
+              <w:rPr>
+                <w:sz w:val="28"/>
+                <w:szCs w:val="28"/>
+              </w:rPr>
+              <w:t>)</w:t>
+            </w:r>
+          </w:p>
+        </w:tc>
+        <w:tc>
+          <w:tcPr>
+            <w:tcW w:w="3486" w:type="dxa"/>
+          </w:tcPr>
+          <w:p>
+            <w:pPr>
+              <w:rPr>
+                <w:sz w:val="28"/>
+                <w:szCs w:val="28"/>
+                <w:lang w:val="uk-UA"/>
+              </w:rPr>
+            </w:pPr>
+            <w:r>
+              <w:rPr>
+                <w:sz w:val="28"/>
+                <w:szCs w:val="28"/>
+                <w:lang w:val="uk-UA"/>
+              </w:rPr>
+              <w:t>Результати_Учасника_3НФ</w:t>
+            </w:r>
+          </w:p>
+        </w:tc>
+      </w:tr>
+      <w:tr>
+        <w:tc>
+          <w:tcPr>
+            <w:tcW w:w="1271" w:type="dxa"/>
+            <w:vMerge/>
+          </w:tcPr>
+          <w:p>
+            <w:pPr>
+              <w:rPr>
+                <w:sz w:val="28"/>
+                <w:szCs w:val="28"/>
+                <w:lang w:val="uk-UA"/>
+              </w:rPr>
+            </w:pPr>
+          </w:p>
+        </w:tc>
+        <w:tc>
+          <w:tcPr>
+            <w:tcW w:w="5699" w:type="dxa"/>
+          </w:tcPr>
+          <w:p>
+            <w:pPr>
+              <w:rPr>
+                <w:sz w:val="28"/>
+                <w:szCs w:val="28"/>
+                <w:lang w:val="uk-UA"/>
+              </w:rPr>
+            </w:pPr>
+            <w:proofErr w:type="spellStart"/>
+            <w:r>
+              <w:rPr>
+                <w:sz w:val="28"/>
+                <w:szCs w:val="28"/>
+                <w:lang w:val="uk-UA"/>
+              </w:rPr>
+              <w:t>СпортСупсільство</w:t>
+            </w:r>
+            <w:proofErr w:type="spellEnd"/>
+          </w:p>
+        </w:tc>
+        <w:tc>
+          <w:tcPr>
+            <w:tcW w:w="3486" w:type="dxa"/>
+          </w:tcPr>
+          <w:p>
+            <w:pPr>
+              <w:rPr>
+                <w:sz w:val="28"/>
+                <w:szCs w:val="28"/>
+                <w:lang w:val="uk-UA"/>
+              </w:rPr>
+            </w:pPr>
+            <w:r>
+              <w:rPr>
+                <w:sz w:val="28"/>
+                <w:szCs w:val="28"/>
+                <w:lang w:val="uk-UA"/>
+              </w:rPr>
+              <w:t>Команда_3НФ</w:t>
+            </w:r>
+          </w:p>
+        </w:tc>
+      </w:tr>
+      <w:tr>
+        <w:tc>
+          <w:tcPr>
+            <w:tcW w:w="1271" w:type="dxa"/>
+            <w:vMerge/>
+          </w:tcPr>
+          <w:p>
+            <w:pPr>
+              <w:rPr>
+                <w:sz w:val="28"/>
+                <w:szCs w:val="28"/>
+                <w:lang w:val="uk-UA"/>
+              </w:rPr>
+            </w:pPr>
+          </w:p>
+        </w:tc>
+        <w:tc>
+          <w:tcPr>
+            <w:tcW w:w="5699" w:type="dxa"/>
+          </w:tcPr>
+          <w:p>
+            <w:pPr>
+              <w:tabs>
+                <w:tab w:val="left" w:pos="965"/>
+              </w:tabs>
+              <w:rPr>
+                <w:sz w:val="28"/>
+                <w:szCs w:val="28"/>
+                <w:lang w:val="uk-UA"/>
+              </w:rPr>
+            </w:pPr>
+            <w:r>
+              <w:rPr>
+                <w:sz w:val="28"/>
+                <w:szCs w:val="28"/>
+                <w:lang w:val="uk-UA"/>
+              </w:rPr>
+              <w:t>Місто</w:t>
+            </w:r>
+          </w:p>
+        </w:tc>
+        <w:tc>
+          <w:tcPr>
+            <w:tcW w:w="3486" w:type="dxa"/>
+          </w:tcPr>
+          <w:p>
+            <w:pPr>
+              <w:rPr>
+                <w:sz w:val="28"/>
+                <w:szCs w:val="28"/>
+                <w:lang w:val="uk-UA"/>
+              </w:rPr>
+            </w:pPr>
+            <w:r>
+              <w:rPr>
+                <w:sz w:val="28"/>
+                <w:szCs w:val="28"/>
+                <w:lang w:val="uk-UA"/>
+              </w:rPr>
+              <w:t>Розташування</w:t>
+            </w:r>
+          </w:p>
+        </w:tc>
+      </w:tr>
+      <w:tr>
+        <w:tc>
+          <w:tcPr>
+            <w:tcW w:w="1271" w:type="dxa"/>
+            <w:vMerge/>
+          </w:tcPr>
+          <w:p>
+            <w:pPr>
+              <w:rPr>
+                <w:sz w:val="28"/>
+                <w:szCs w:val="28"/>
+                <w:lang w:val="uk-UA"/>
+              </w:rPr>
+            </w:pPr>
+          </w:p>
+        </w:tc>
+        <w:tc>
+          <w:tcPr>
+            <w:tcW w:w="5699" w:type="dxa"/>
+          </w:tcPr>
+          <w:p>
+            <w:pPr>
+              <w:rPr>
+                <w:sz w:val="28"/>
+                <w:szCs w:val="28"/>
+              </w:rPr>
+            </w:pPr>
+            <w:proofErr w:type="spellStart"/>
+            <w:r>
+              <w:rPr>
+                <w:sz w:val="28"/>
+                <w:szCs w:val="28"/>
+                <w:lang w:val="uk-UA"/>
+              </w:rPr>
+              <w:t>Ім’яТренера</w:t>
+            </w:r>
+            <w:proofErr w:type="spellEnd"/>
+            <w:r>
+              <w:rPr>
+                <w:sz w:val="28"/>
+                <w:szCs w:val="28"/>
+                <w:lang w:val="uk-UA"/>
+              </w:rPr>
+              <w:t xml:space="preserve"> + </w:t>
+            </w:r>
+            <w:proofErr w:type="spellStart"/>
+            <w:r>
+              <w:rPr>
+                <w:sz w:val="28"/>
+                <w:szCs w:val="28"/>
+                <w:lang w:val="uk-UA"/>
+              </w:rPr>
+              <w:t>ПрізвищеТренера</w:t>
+            </w:r>
+            <w:proofErr w:type="spellEnd"/>
+          </w:p>
+        </w:tc>
+        <w:tc>
+          <w:tcPr>
+            <w:tcW w:w="3486" w:type="dxa"/>
+          </w:tcPr>
+          <w:p>
+            <w:pPr>
+              <w:rPr>
+                <w:sz w:val="28"/>
+                <w:szCs w:val="28"/>
+                <w:lang w:val="uk-UA"/>
+              </w:rPr>
+            </w:pPr>
+            <w:r>
+              <w:rPr>
+                <w:sz w:val="28"/>
+                <w:szCs w:val="28"/>
+                <w:lang w:val="uk-UA"/>
+              </w:rPr>
+              <w:t>Тренер</w:t>
+            </w:r>
           </w:p>
         </w:tc>
       </w:tr>
@@ -1160,9 +1816,9 @@
           <w:noProof/>
         </w:rPr>
         <w:drawing>
-          <wp:inline distT="0" distB="0" distL="0" distR="0" wp14:anchorId="4E9EA47B" wp14:editId="3A0582F4">
-            <wp:extent cx="4807671" cy="3295465"/>
-            <wp:effectExtent l="0" t="0" r="0" b="635"/>
+          <wp:inline distT="0" distB="0" distL="0" distR="0" wp14:anchorId="197F729E" wp14:editId="495CCBD9">
+            <wp:extent cx="4267200" cy="3829050"/>
+            <wp:effectExtent l="0" t="0" r="0" b="0"/>
             <wp:docPr id="1" name="Рисунок 1"/>
             <wp:cNvGraphicFramePr>
               <a:graphicFrameLocks xmlns:a="http://schemas.openxmlformats.org/drawingml/2006/main" noChangeAspect="1"/>
@@ -1183,7 +1839,7 @@
                   <pic:spPr>
                     <a:xfrm>
                       <a:off x="0" y="0"/>
-                      <a:ext cx="4814740" cy="3300311"/>
+                      <a:ext cx="4267200" cy="3829050"/>
                     </a:xfrm>
                     <a:prstGeom prst="rect">
                       <a:avLst/>
@@ -1205,25 +1861,170 @@
           <w:lang w:val="uk-UA"/>
         </w:rPr>
       </w:pPr>
-    </w:p>
-    <w:p>
-      <w:pPr>
-        <w:spacing w:after="0"/>
-        <w:rPr>
-          <w:sz w:val="28"/>
-          <w:szCs w:val="28"/>
-        </w:rPr>
-      </w:pPr>
-    </w:p>
-    <w:p>
-      <w:pPr>
-        <w:spacing w:after="0"/>
-        <w:rPr>
-          <w:sz w:val="28"/>
-          <w:szCs w:val="28"/>
-          <w:lang w:val="uk-UA"/>
-        </w:rPr>
-      </w:pPr>
+      <w:r>
+        <w:rPr>
+          <w:sz w:val="28"/>
+          <w:szCs w:val="28"/>
+          <w:lang w:val="uk-UA"/>
+        </w:rPr>
+        <w:t>Перша нормальна форма</w:t>
+      </w:r>
+      <w:r>
+        <w:rPr>
+          <w:sz w:val="28"/>
+          <w:szCs w:val="28"/>
+          <w:lang w:val="uk-UA"/>
+        </w:rPr>
+        <w:t xml:space="preserve">: </w:t>
+      </w:r>
+    </w:p>
+    <w:p>
+      <w:pPr>
+        <w:spacing w:after="0"/>
+        <w:rPr>
+          <w:sz w:val="28"/>
+          <w:szCs w:val="28"/>
+          <w:lang w:val="en-US"/>
+        </w:rPr>
+      </w:pPr>
+      <w:r>
+        <w:rPr>
+          <w:noProof/>
+        </w:rPr>
+        <w:drawing>
+          <wp:inline distT="0" distB="0" distL="0" distR="0" wp14:anchorId="6E050579" wp14:editId="51AFF69B">
+            <wp:extent cx="4105275" cy="4724400"/>
+            <wp:effectExtent l="0" t="0" r="9525" b="0"/>
+            <wp:docPr id="3" name="Рисунок 3"/>
+            <wp:cNvGraphicFramePr>
+              <a:graphicFrameLocks xmlns:a="http://schemas.openxmlformats.org/drawingml/2006/main" noChangeAspect="1"/>
+            </wp:cNvGraphicFramePr>
+            <a:graphic xmlns:a="http://schemas.openxmlformats.org/drawingml/2006/main">
+              <a:graphicData uri="http://schemas.openxmlformats.org/drawingml/2006/picture">
+                <pic:pic xmlns:pic="http://schemas.openxmlformats.org/drawingml/2006/picture">
+                  <pic:nvPicPr>
+                    <pic:cNvPr id="1" name=""/>
+                    <pic:cNvPicPr/>
+                  </pic:nvPicPr>
+                  <pic:blipFill>
+                    <a:blip r:embed="rId5"/>
+                    <a:stretch>
+                      <a:fillRect/>
+                    </a:stretch>
+                  </pic:blipFill>
+                  <pic:spPr>
+                    <a:xfrm>
+                      <a:off x="0" y="0"/>
+                      <a:ext cx="4105275" cy="4724400"/>
+                    </a:xfrm>
+                    <a:prstGeom prst="rect">
+                      <a:avLst/>
+                    </a:prstGeom>
+                  </pic:spPr>
+                </pic:pic>
+              </a:graphicData>
+            </a:graphic>
+          </wp:inline>
+        </w:drawing>
+      </w:r>
+    </w:p>
+    <w:p>
+      <w:pPr>
+        <w:spacing w:after="0"/>
+        <w:rPr>
+          <w:sz w:val="28"/>
+          <w:szCs w:val="28"/>
+        </w:rPr>
+      </w:pPr>
+    </w:p>
+    <w:p>
+      <w:pPr>
+        <w:spacing w:after="0"/>
+        <w:rPr>
+          <w:sz w:val="28"/>
+          <w:szCs w:val="28"/>
+          <w:lang w:val="uk-UA"/>
+        </w:rPr>
+      </w:pPr>
+    </w:p>
+    <w:p>
+      <w:pPr>
+        <w:spacing w:after="0"/>
+        <w:rPr>
+          <w:sz w:val="28"/>
+          <w:szCs w:val="28"/>
+          <w:lang w:val="uk-UA"/>
+        </w:rPr>
+      </w:pPr>
+    </w:p>
+    <w:p>
+      <w:pPr>
+        <w:spacing w:after="0"/>
+        <w:rPr>
+          <w:sz w:val="28"/>
+          <w:szCs w:val="28"/>
+          <w:lang w:val="en-US"/>
+        </w:rPr>
+      </w:pPr>
+      <w:r>
+        <w:rPr>
+          <w:sz w:val="28"/>
+          <w:szCs w:val="28"/>
+          <w:lang w:val="uk-UA"/>
+        </w:rPr>
+        <w:lastRenderedPageBreak/>
+        <w:t>Друга нормальна форма:</w:t>
+      </w:r>
+    </w:p>
+    <w:p>
+      <w:pPr>
+        <w:spacing w:after="0"/>
+        <w:rPr>
+          <w:sz w:val="28"/>
+          <w:szCs w:val="28"/>
+          <w:lang w:val="uk-UA"/>
+        </w:rPr>
+      </w:pPr>
+      <w:r>
+        <w:rPr>
+          <w:noProof/>
+        </w:rPr>
+        <w:drawing>
+          <wp:inline distT="0" distB="0" distL="0" distR="0" wp14:anchorId="438114A7" wp14:editId="74EBAEBA">
+            <wp:extent cx="6645910" cy="5083810"/>
+            <wp:effectExtent l="0" t="0" r="2540" b="2540"/>
+            <wp:docPr id="4" name="Рисунок 4"/>
+            <wp:cNvGraphicFramePr>
+              <a:graphicFrameLocks xmlns:a="http://schemas.openxmlformats.org/drawingml/2006/main" noChangeAspect="1"/>
+            </wp:cNvGraphicFramePr>
+            <a:graphic xmlns:a="http://schemas.openxmlformats.org/drawingml/2006/main">
+              <a:graphicData uri="http://schemas.openxmlformats.org/drawingml/2006/picture">
+                <pic:pic xmlns:pic="http://schemas.openxmlformats.org/drawingml/2006/picture">
+                  <pic:nvPicPr>
+                    <pic:cNvPr id="1" name=""/>
+                    <pic:cNvPicPr/>
+                  </pic:nvPicPr>
+                  <pic:blipFill>
+                    <a:blip r:embed="rId6"/>
+                    <a:stretch>
+                      <a:fillRect/>
+                    </a:stretch>
+                  </pic:blipFill>
+                  <pic:spPr>
+                    <a:xfrm>
+                      <a:off x="0" y="0"/>
+                      <a:ext cx="6645910" cy="5083810"/>
+                    </a:xfrm>
+                    <a:prstGeom prst="rect">
+                      <a:avLst/>
+                    </a:prstGeom>
+                  </pic:spPr>
+                </pic:pic>
+              </a:graphicData>
+            </a:graphic>
+          </wp:inline>
+        </w:drawing>
+      </w:r>
     </w:p>
     <w:p>
       <w:pPr>
@@ -1236,14 +2037,97 @@
           <w:lang w:val="uk-UA"/>
         </w:rPr>
       </w:pPr>
-      <w:r>
+    </w:p>
+    <w:p>
+      <w:pPr>
+        <w:spacing w:after="0"/>
+        <w:rPr>
+          <w:sz w:val="28"/>
+          <w:szCs w:val="28"/>
+          <w:lang w:val="uk-UA"/>
+        </w:rPr>
+      </w:pPr>
+      <w:r>
+        <w:rPr>
+          <w:sz w:val="28"/>
+          <w:szCs w:val="28"/>
+          <w:lang w:val="uk-UA"/>
+        </w:rPr>
+        <w:t>Третя нормальна форма:</w:t>
+      </w:r>
+    </w:p>
+    <w:p>
+      <w:pPr>
+        <w:spacing w:after="0"/>
         <w:rPr>
           <w:b/>
           <w:bCs/>
           <w:sz w:val="28"/>
           <w:szCs w:val="28"/>
-          <w:lang w:val="uk-UA"/>
-        </w:rPr>
+          <w:lang w:val="en-US"/>
+        </w:rPr>
+      </w:pPr>
+      <w:r>
+        <w:rPr>
+          <w:noProof/>
+        </w:rPr>
+        <w:drawing>
+          <wp:inline distT="0" distB="0" distL="0" distR="0" wp14:anchorId="0E2F28E6" wp14:editId="2F439234">
+            <wp:extent cx="6267872" cy="3817856"/>
+            <wp:effectExtent l="0" t="0" r="0" b="0"/>
+            <wp:docPr id="5" name="Рисунок 5"/>
+            <wp:cNvGraphicFramePr>
+              <a:graphicFrameLocks xmlns:a="http://schemas.openxmlformats.org/drawingml/2006/main" noChangeAspect="1"/>
+            </wp:cNvGraphicFramePr>
+            <a:graphic xmlns:a="http://schemas.openxmlformats.org/drawingml/2006/main">
+              <a:graphicData uri="http://schemas.openxmlformats.org/drawingml/2006/picture">
+                <pic:pic xmlns:pic="http://schemas.openxmlformats.org/drawingml/2006/picture">
+                  <pic:nvPicPr>
+                    <pic:cNvPr id="1" name=""/>
+                    <pic:cNvPicPr/>
+                  </pic:nvPicPr>
+                  <pic:blipFill>
+                    <a:blip r:embed="rId7"/>
+                    <a:stretch>
+                      <a:fillRect/>
+                    </a:stretch>
+                  </pic:blipFill>
+                  <pic:spPr>
+                    <a:xfrm>
+                      <a:off x="0" y="0"/>
+                      <a:ext cx="6282713" cy="3826896"/>
+                    </a:xfrm>
+                    <a:prstGeom prst="rect">
+                      <a:avLst/>
+                    </a:prstGeom>
+                  </pic:spPr>
+                </pic:pic>
+              </a:graphicData>
+            </a:graphic>
+          </wp:inline>
+        </w:drawing>
+      </w:r>
+    </w:p>
+    <w:p>
+      <w:pPr>
+        <w:spacing w:after="0"/>
+        <w:rPr>
+          <w:b/>
+          <w:bCs/>
+          <w:sz w:val="28"/>
+          <w:szCs w:val="28"/>
+          <w:lang w:val="uk-UA"/>
+        </w:rPr>
+      </w:pPr>
+      <w:r>
+        <w:rPr>
+          <w:b/>
+          <w:bCs/>
+          <w:sz w:val="28"/>
+          <w:szCs w:val="28"/>
+          <w:lang w:val="uk-UA"/>
+        </w:rPr>
+        <w:lastRenderedPageBreak/>
         <w:t>Контрольні запитання:</w:t>
       </w:r>
     </w:p>
@@ -1271,7 +2155,6 @@
         <w:rPr>
           <w:sz w:val="28"/>
           <w:szCs w:val="28"/>
-          <w:lang w:val="uk-UA"/>
         </w:rPr>
       </w:pPr>
       <w:r>
@@ -1282,6 +2165,29 @@
         </w:rPr>
         <w:t xml:space="preserve">– </w:t>
       </w:r>
+      <w:r>
+        <w:rPr>
+          <w:sz w:val="28"/>
+          <w:szCs w:val="28"/>
+          <w:lang w:val="uk-UA"/>
+        </w:rPr>
+        <w:t xml:space="preserve">Нормалізація </w:t>
+      </w:r>
+      <w:r>
+        <w:rPr>
+          <w:sz w:val="28"/>
+          <w:szCs w:val="28"/>
+        </w:rPr>
+        <w:t>–</w:t>
+      </w:r>
+      <w:r>
+        <w:rPr>
+          <w:sz w:val="28"/>
+          <w:szCs w:val="28"/>
+          <w:lang w:val="uk-UA"/>
+        </w:rPr>
+        <w:t xml:space="preserve"> це процес скорочення повторень інформації в базі даних.</w:t>
+      </w:r>
     </w:p>
     <w:p>
       <w:pPr>
@@ -1328,6 +2234,32 @@
         </w:rPr>
         <w:t xml:space="preserve">– </w:t>
       </w:r>
+      <w:r>
+        <w:rPr>
+          <w:sz w:val="28"/>
+          <w:szCs w:val="28"/>
+          <w:lang w:val="uk-UA"/>
+        </w:rPr>
+        <w:t xml:space="preserve">Головною перевагою нормалізованих відносин у базі даних є запобігання аномаліям, що виникають через дефекти </w:t>
+      </w:r>
+      <w:proofErr w:type="spellStart"/>
+      <w:r>
+        <w:rPr>
+          <w:sz w:val="28"/>
+          <w:szCs w:val="28"/>
+          <w:lang w:val="uk-UA"/>
+        </w:rPr>
+        <w:t>проєктування</w:t>
+      </w:r>
+      <w:proofErr w:type="spellEnd"/>
+      <w:r>
+        <w:rPr>
+          <w:sz w:val="28"/>
+          <w:szCs w:val="28"/>
+          <w:lang w:val="uk-UA"/>
+        </w:rPr>
+        <w:t>, саме на які нормалізація й спрямована. Також нормалізація допомагає позбутися надмірності даних.</w:t>
+      </w:r>
     </w:p>
     <w:p>
       <w:pPr>
@@ -1363,7 +2295,6 @@
         <w:rPr>
           <w:sz w:val="28"/>
           <w:szCs w:val="28"/>
-          <w:lang w:val="uk-UA"/>
         </w:rPr>
       </w:pPr>
       <w:r>
@@ -1374,14 +2305,56 @@
         </w:rPr>
         <w:t xml:space="preserve">– </w:t>
       </w:r>
-    </w:p>
-    <w:p>
-      <w:pPr>
-        <w:spacing w:after="0"/>
-        <w:rPr>
-          <w:sz w:val="28"/>
-          <w:szCs w:val="28"/>
-          <w:lang w:val="uk-UA"/>
+      <w:r>
+        <w:rPr>
+          <w:sz w:val="28"/>
+          <w:szCs w:val="28"/>
+          <w:lang w:val="uk-UA"/>
+        </w:rPr>
+        <w:t xml:space="preserve">Ненормалізованими відношеннями в БД є ті відношення </w:t>
+      </w:r>
+      <w:r>
+        <w:rPr>
+          <w:sz w:val="28"/>
+          <w:szCs w:val="28"/>
+          <w:lang w:val="uk-UA"/>
+        </w:rPr>
+        <w:t xml:space="preserve">які містять дефекти </w:t>
+      </w:r>
+      <w:proofErr w:type="spellStart"/>
+      <w:r>
+        <w:rPr>
+          <w:sz w:val="28"/>
+          <w:szCs w:val="28"/>
+          <w:lang w:val="uk-UA"/>
+        </w:rPr>
+        <w:t>проєктування</w:t>
+      </w:r>
+      <w:proofErr w:type="spellEnd"/>
+      <w:r>
+        <w:rPr>
+          <w:sz w:val="28"/>
+          <w:szCs w:val="28"/>
+          <w:lang w:val="uk-UA"/>
+        </w:rPr>
+        <w:t>, що призводять до виникнення аномалій та надмірності даних.</w:t>
+      </w:r>
+      <w:r>
+        <w:rPr>
+          <w:sz w:val="28"/>
+          <w:szCs w:val="28"/>
+          <w:lang w:val="uk-UA"/>
+        </w:rPr>
+        <w:t xml:space="preserve"> </w:t>
+      </w:r>
+    </w:p>
+    <w:p>
+      <w:pPr>
+        <w:spacing w:after="0"/>
+        <w:rPr>
+          <w:sz w:val="28"/>
+          <w:szCs w:val="28"/>
+          <w:lang w:val="en-US"/>
         </w:rPr>
       </w:pPr>
     </w:p>
@@ -1425,7 +2398,6 @@
         <w:rPr>
           <w:sz w:val="28"/>
           <w:szCs w:val="28"/>
-          <w:lang w:val="uk-UA"/>
         </w:rPr>
       </w:pPr>
       <w:r>
@@ -1436,26 +2408,184 @@
         </w:rPr>
         <w:t xml:space="preserve">– </w:t>
       </w:r>
-    </w:p>
-    <w:p>
-      <w:pPr>
-        <w:spacing w:after="0"/>
-        <w:rPr>
-          <w:sz w:val="28"/>
-          <w:szCs w:val="28"/>
-          <w:lang w:val="uk-UA"/>
-        </w:rPr>
-      </w:pPr>
-    </w:p>
-    <w:p>
-      <w:pPr>
-        <w:spacing w:after="0"/>
-        <w:rPr>
-          <w:sz w:val="28"/>
-          <w:szCs w:val="28"/>
-          <w:lang w:val="uk-UA"/>
-        </w:rPr>
-      </w:pPr>
+      <w:r>
+        <w:rPr>
+          <w:sz w:val="28"/>
+          <w:szCs w:val="28"/>
+          <w:lang w:val="uk-UA"/>
+        </w:rPr>
+        <w:t xml:space="preserve">Нормалізація не є повсюдно необхідною. Хоча зазвичай нормалізація проводиться до 3 нормальної форми, іноді і цього не потрібно. Річ у тім, що зі збільшенням таблиць зростає і час виконання операцій і складність складення запитів, тому іноді використовують </w:t>
+      </w:r>
+      <w:proofErr w:type="spellStart"/>
+      <w:r>
+        <w:rPr>
+          <w:sz w:val="28"/>
+          <w:szCs w:val="28"/>
+          <w:lang w:val="uk-UA"/>
+        </w:rPr>
+        <w:t>денормалізовані</w:t>
+      </w:r>
+      <w:proofErr w:type="spellEnd"/>
+      <w:r>
+        <w:rPr>
+          <w:sz w:val="28"/>
+          <w:szCs w:val="28"/>
+          <w:lang w:val="uk-UA"/>
+        </w:rPr>
+        <w:t xml:space="preserve"> таблиці там, де необхідна швидкість і зручність. </w:t>
+      </w:r>
+    </w:p>
+    <w:p>
+      <w:pPr>
+        <w:spacing w:after="0"/>
+        <w:rPr>
+          <w:sz w:val="28"/>
+          <w:szCs w:val="28"/>
+          <w:lang w:val="uk-UA"/>
+        </w:rPr>
+      </w:pPr>
+    </w:p>
+    <w:p>
+      <w:pPr>
+        <w:spacing w:after="0"/>
+        <w:rPr>
+          <w:sz w:val="28"/>
+          <w:szCs w:val="28"/>
+          <w:lang w:val="uk-UA"/>
+        </w:rPr>
+      </w:pPr>
+      <w:r>
+        <w:rPr>
+          <w:b/>
+          <w:bCs/>
+          <w:sz w:val="28"/>
+          <w:szCs w:val="28"/>
+          <w:lang w:val="uk-UA"/>
+        </w:rPr>
+        <w:t>Висновок:</w:t>
+      </w:r>
+      <w:r>
+        <w:rPr>
+          <w:sz w:val="28"/>
+          <w:szCs w:val="28"/>
+          <w:lang w:val="uk-UA"/>
+        </w:rPr>
+        <w:t xml:space="preserve"> Була проведена робота над </w:t>
+      </w:r>
+      <w:proofErr w:type="spellStart"/>
+      <w:r>
+        <w:rPr>
+          <w:sz w:val="28"/>
+          <w:szCs w:val="28"/>
+          <w:lang w:val="uk-UA"/>
+        </w:rPr>
+        <w:t>п</w:t>
+      </w:r>
+      <w:r>
+        <w:rPr>
+          <w:sz w:val="28"/>
+          <w:szCs w:val="28"/>
+          <w:lang w:val="uk-UA"/>
+        </w:rPr>
+        <w:t>роєктування</w:t>
+      </w:r>
+      <w:r>
+        <w:rPr>
+          <w:sz w:val="28"/>
+          <w:szCs w:val="28"/>
+          <w:lang w:val="uk-UA"/>
+        </w:rPr>
+        <w:t>м</w:t>
+      </w:r>
+      <w:proofErr w:type="spellEnd"/>
+      <w:r>
+        <w:rPr>
+          <w:sz w:val="28"/>
+          <w:szCs w:val="28"/>
+          <w:lang w:val="uk-UA"/>
+        </w:rPr>
+        <w:t xml:space="preserve"> структури БД</w:t>
+      </w:r>
+      <w:r>
+        <w:rPr>
+          <w:sz w:val="28"/>
+          <w:szCs w:val="28"/>
+          <w:lang w:val="uk-UA"/>
+        </w:rPr>
+        <w:t>,</w:t>
+      </w:r>
+      <w:r>
+        <w:rPr>
+          <w:sz w:val="28"/>
+          <w:szCs w:val="28"/>
+          <w:lang w:val="uk-UA"/>
+        </w:rPr>
+        <w:t xml:space="preserve"> </w:t>
+      </w:r>
+      <w:r>
+        <w:rPr>
+          <w:sz w:val="28"/>
+          <w:szCs w:val="28"/>
+          <w:lang w:val="uk-UA"/>
+        </w:rPr>
+        <w:t>н</w:t>
+      </w:r>
+      <w:r>
+        <w:rPr>
+          <w:sz w:val="28"/>
+          <w:szCs w:val="28"/>
+          <w:lang w:val="uk-UA"/>
+        </w:rPr>
+        <w:t>ормалізац</w:t>
+      </w:r>
+      <w:r>
+        <w:rPr>
+          <w:sz w:val="28"/>
+          <w:szCs w:val="28"/>
+          <w:lang w:val="uk-UA"/>
+        </w:rPr>
+        <w:t>ією</w:t>
+      </w:r>
+      <w:r>
+        <w:rPr>
+          <w:sz w:val="28"/>
+          <w:szCs w:val="28"/>
+          <w:lang w:val="uk-UA"/>
+        </w:rPr>
+        <w:t xml:space="preserve"> відношень.</w:t>
+      </w:r>
+      <w:r>
+        <w:rPr>
+          <w:sz w:val="28"/>
+          <w:szCs w:val="28"/>
+          <w:lang w:val="uk-UA"/>
+        </w:rPr>
+        <w:t xml:space="preserve"> </w:t>
+      </w:r>
+      <w:r>
+        <w:rPr>
+          <w:sz w:val="28"/>
+          <w:szCs w:val="28"/>
+          <w:lang w:val="uk-UA"/>
+        </w:rPr>
+        <w:t xml:space="preserve"> </w:t>
+      </w:r>
+      <w:r>
+        <w:rPr>
+          <w:sz w:val="28"/>
+          <w:szCs w:val="28"/>
+          <w:lang w:val="uk-UA"/>
+        </w:rPr>
+        <w:t xml:space="preserve">Придбані практичні навички </w:t>
+      </w:r>
+      <w:r>
+        <w:rPr>
+          <w:sz w:val="28"/>
+          <w:szCs w:val="28"/>
+          <w:lang w:val="uk-UA"/>
+        </w:rPr>
+        <w:t>приводити відношення відповідно до нормальних форм.</w:t>
+      </w:r>
     </w:p>
     <w:sectPr>
       <w:pgSz w:w="11906" w:h="16838"/>

</xml_diff>